<commit_message>
sync: 4/27 마무리 — figure_1 재생성 + Conclusion 슬라이드 + References + 임채림 석사 + RQ3 ID 1~7
- ↔ → "vs" 일괄 변경 (이모지 렌더링 방지)
- RQ3 ID (A)(B)(C)(E)(F)(G)(H) → 1~7 번호 (보고서 표 3 + 발표 S12)
- figure_1 (Phase 4 scatter) matplotlib 2×2 격자 재생성 (X축 겹침 해소, 통계박스 폰트 10pt)
- Conclusion 슬라이드 (S16) 신설 — 4 핵심 발견 카드 + 인용
- About Team 4-step 카드 (S15) 강화 — 각자 highlight
- 보고서 §6 References section 신설 (8 건: Exqutor / Cohen / Horvitz-Thompson / Neyman / Wilcoxon / Indyk-Motwani / JL / Acharya)
- 임채림 석사 표기 정정 (이채림 → 임채림 전수)
- S6 Two-Level figure 제거 (텍스트 박스 충돌 해소, S11 에 큰 사이즈로 표시)
- S8 layout 재구성 (좌 표 + 우 figure 정사각)
- 4 라운드 딥리뷰 통과 (CRITICAL 0, HIGH 11 모두 해소)
- 다음 세션 프롬프트 작성 (_internal/next_session_prompt.md)

다음 세션 (4/28 마감 직전): 울트라리뷰 + figure A 등급 재생성 (figure_9/10/2/6) + 최종 LearnUs 업로드

Co-Authored-By: Claude Opus 4.7 (1M context) <noreply@anthropic.com>
</commit_message>
<xml_diff>
--- a/submission/_drafts/속도는벡터_중간보고서.docx
+++ b/submission/_drafts/속도는벡터_중간보고서.docx
@@ -2455,7 +2455,7 @@
       <w:r>
         <w:drawing>
           <wp:inline xmlns:a="http://schemas.openxmlformats.org/drawingml/2006/main" xmlns:pic="http://schemas.openxmlformats.org/drawingml/2006/picture">
-            <wp:extent cx="5303520" cy="1437165"/>
+            <wp:extent cx="5029200" cy="1362828"/>
             <wp:docPr id="3" name="Picture 3"/>
             <wp:cNvGraphicFramePr>
               <a:graphicFrameLocks noChangeAspect="1"/>
@@ -2476,7 +2476,7 @@
                   <pic:spPr>
                     <a:xfrm>
                       <a:off x="0" y="0"/>
-                      <a:ext cx="5303520" cy="1437165"/>
+                      <a:ext cx="5029200" cy="1362828"/>
                     </a:xfrm>
                     <a:prstGeom prst="rect"/>
                   </pic:spPr>
@@ -2499,7 +2499,7 @@
           <w:i w:val="0"/>
           <w:sz w:val="19"/>
         </w:rPr>
-        <w:t>그림 3.  SYSTEM ↔ BERNOULLI paired Q-error 의 4 selectivity panel (s = 0.05 / 0.10 / 0.30 / 0.50)</w:t>
+        <w:t>그림 3.  SYSTEM vs BERNOULLI paired Q-error 의 4 selectivity panel (s = 0.05 / 0.10 / 0.30 / 0.50, 2×2 격자)</w:t>
       </w:r>
     </w:p>
     <w:p>
@@ -3034,7 +3034,7 @@
           <w:i w:val="0"/>
           <w:sz w:val="19"/>
         </w:rPr>
-        <w:t>그림 4.  Phase 6 Step 4 — BERNOULLI ↔ STRATIFIED (KM20) 100 query × 6 selectivity boxplot (DEEP 1M, native vector.c 측정)</w:t>
+        <w:t>그림 4.  Phase 6 Step 4 — BERNOULLI vs STRATIFIED (KM20) 100 query × 6 selectivity boxplot (DEEP 1M, native vector.c 측정)</w:t>
       </w:r>
     </w:p>
     <w:p>
@@ -3488,7 +3488,7 @@
                 <w:i w:val="0"/>
                 <w:sz w:val="20"/>
               </w:rPr>
-              <w:t>방법 ID</w:t>
+              <w:t>번호</w:t>
             </w:r>
           </w:p>
         </w:tc>
@@ -3510,7 +3510,7 @@
                 <w:i w:val="0"/>
                 <w:sz w:val="20"/>
               </w:rPr>
-              <w:t>이름</w:t>
+              <w:t>방법 이름</w:t>
             </w:r>
           </w:p>
         </w:tc>
@@ -3576,7 +3576,7 @@
                 <w:i w:val="0"/>
                 <w:sz w:val="20"/>
               </w:rPr>
-              <w:t>(A)</w:t>
+              <w:t>1</w:t>
             </w:r>
           </w:p>
         </w:tc>
@@ -3659,7 +3659,7 @@
                 <w:i w:val="0"/>
                 <w:sz w:val="20"/>
               </w:rPr>
-              <w:t>(C)</w:t>
+              <w:t>2</w:t>
             </w:r>
           </w:p>
         </w:tc>
@@ -3742,7 +3742,7 @@
                 <w:i w:val="0"/>
                 <w:sz w:val="20"/>
               </w:rPr>
-              <w:t>(E)</w:t>
+              <w:t>3</w:t>
             </w:r>
           </w:p>
         </w:tc>
@@ -3825,7 +3825,7 @@
                 <w:i w:val="0"/>
                 <w:sz w:val="20"/>
               </w:rPr>
-              <w:t>(F)</w:t>
+              <w:t>4</w:t>
             </w:r>
           </w:p>
         </w:tc>
@@ -3908,7 +3908,7 @@
                 <w:i w:val="0"/>
                 <w:sz w:val="20"/>
               </w:rPr>
-              <w:t>(G)</w:t>
+              <w:t>5</w:t>
             </w:r>
           </w:p>
         </w:tc>
@@ -3991,7 +3991,7 @@
                 <w:i w:val="0"/>
                 <w:sz w:val="20"/>
               </w:rPr>
-              <w:t>(B)</w:t>
+              <w:t>6</w:t>
             </w:r>
           </w:p>
         </w:tc>
@@ -4074,7 +4074,7 @@
                 <w:i w:val="0"/>
                 <w:sz w:val="20"/>
               </w:rPr>
-              <w:t>(H)</w:t>
+              <w:t>7</w:t>
             </w:r>
           </w:p>
         </w:tc>
@@ -4215,7 +4215,7 @@
           <w:i w:val="0"/>
           <w:sz w:val="22"/>
         </w:rPr>
-        <w:t>실험 측면에서는 본 보고서에 보고된 모든 결과 — 표 1 의 SYSTEM ↔ BERNOULLI 비교, 표 2 의 5-seed 신뢰구간, 그림 1 ~ 8 의 vector.c 패치 시각화, RQ1 negative result heatmap, scatter / boxplot 직교 측정, 외적 타당성 cross-dataset bar, selectivity gradient, Two-Level decomposition, 그리고 cluster skew 비교 — 가 모두 확보된 상태이다. 모든 측정 데이터와 빌드 산출물은 재현 가능하도록 보존하였으며, 원본 코드와 수정본을 함께 유지하여 추후의 검증과 비교를 용이하게 하였다. RQ3 의 측정 결과는 5 월의 비교 실험을 마친 뒤 최종보고서에서 보고한다.</w:t>
+        <w:t>실험 측면에서는 본 보고서에 보고된 모든 결과 — 표 1 의 SYSTEM vs BERNOULLI 비교, 표 2 의 5-seed 신뢰구간, 그림 1 ~ 8 의 vector.c 패치 시각화, RQ1 negative result heatmap, scatter / boxplot 직교 측정, 외적 타당성 cross-dataset bar, selectivity gradient, Two-Level decomposition, 그리고 cluster skew 비교 — 가 모두 확보된 상태이다. 모든 측정 데이터와 빌드 산출물은 재현 가능하도록 보존하였으며, 원본 코드와 수정본을 함께 유지하여 추후의 검증과 비교를 용이하게 하였다. RQ3 의 측정 결과는 5 월의 비교 실험을 마친 뒤 최종보고서에서 보고한다.</w:t>
       </w:r>
     </w:p>
     <w:p>
@@ -5024,6 +5024,358 @@
         <w:t>중간발표 이후의 5 월은 RQ3 의 일곱 가지 sampling 방법을 동일한 측정 파이프라인에서 비교하는 작업에 집중하며, 6 월에는 최종발표·전시회·최종보고서 작성을 마무리한다.</w:t>
       </w:r>
     </w:p>
+    <w:p>
+      <w:pPr>
+        <w:keepNext/>
+        <w:pageBreakBefore/>
+        <w:spacing w:before="0" w:after="120"/>
+      </w:pPr>
+      <w:r>
+        <w:rPr>
+          <w:rFonts w:ascii="Helvetica Neue" w:hAnsi="Helvetica Neue" w:eastAsia="Apple SD Gothic Neo"/>
+          <w:b/>
+          <w:i w:val="0"/>
+          <w:sz w:val="34"/>
+        </w:rPr>
+        <w:t>6.  참고문헌</w:t>
+      </w:r>
+    </w:p>
+    <w:p>
+      <w:pPr>
+        <w:spacing w:after="120" w:line="336" w:lineRule="auto"/>
+        <w:ind w:left="454" w:hanging="454"/>
+      </w:pPr>
+      <w:r>
+        <w:rPr>
+          <w:rFonts w:ascii="Helvetica Neue" w:hAnsi="Helvetica Neue" w:eastAsia="Apple SD Gothic Neo"/>
+          <w:b/>
+          <w:i w:val="0"/>
+          <w:sz w:val="20"/>
+        </w:rPr>
+        <w:t xml:space="preserve">[1] </w:t>
+      </w:r>
+      <w:r>
+        <w:rPr>
+          <w:rFonts w:ascii="Helvetica Neue" w:hAnsi="Helvetica Neue" w:eastAsia="Apple SD Gothic Neo"/>
+          <w:b w:val="0"/>
+          <w:i w:val="0"/>
+          <w:sz w:val="20"/>
+        </w:rPr>
+        <w:t xml:space="preserve">Han, et al. (2024). </w:t>
+      </w:r>
+      <w:r>
+        <w:rPr>
+          <w:rFonts w:ascii="Helvetica Neue" w:hAnsi="Helvetica Neue" w:eastAsia="Apple SD Gothic Neo"/>
+          <w:b w:val="0"/>
+          <w:i/>
+          <w:sz w:val="20"/>
+        </w:rPr>
+        <w:t xml:space="preserve">Exqutor: Extended Query Optimizer for Vector-augmented Analytical Queries. </w:t>
+      </w:r>
+      <w:r>
+        <w:rPr>
+          <w:rFonts w:ascii="Helvetica Neue" w:hAnsi="Helvetica Neue" w:eastAsia="Apple SD Gothic Neo"/>
+          <w:b w:val="0"/>
+          <w:i w:val="0"/>
+          <w:sz w:val="20"/>
+        </w:rPr>
+        <w:t>arXiv:2512.09695v2.</w:t>
+      </w:r>
+    </w:p>
+    <w:p>
+      <w:pPr>
+        <w:spacing w:after="120" w:line="336" w:lineRule="auto"/>
+        <w:ind w:left="454" w:hanging="454"/>
+      </w:pPr>
+      <w:r>
+        <w:rPr>
+          <w:rFonts w:ascii="Helvetica Neue" w:hAnsi="Helvetica Neue" w:eastAsia="Apple SD Gothic Neo"/>
+          <w:b/>
+          <w:i w:val="0"/>
+          <w:sz w:val="20"/>
+        </w:rPr>
+        <w:t xml:space="preserve">[2] </w:t>
+      </w:r>
+      <w:r>
+        <w:rPr>
+          <w:rFonts w:ascii="Helvetica Neue" w:hAnsi="Helvetica Neue" w:eastAsia="Apple SD Gothic Neo"/>
+          <w:b w:val="0"/>
+          <w:i w:val="0"/>
+          <w:sz w:val="20"/>
+        </w:rPr>
+        <w:t xml:space="preserve">Cohen, J. (1988). </w:t>
+      </w:r>
+      <w:r>
+        <w:rPr>
+          <w:rFonts w:ascii="Helvetica Neue" w:hAnsi="Helvetica Neue" w:eastAsia="Apple SD Gothic Neo"/>
+          <w:b w:val="0"/>
+          <w:i/>
+          <w:sz w:val="20"/>
+        </w:rPr>
+        <w:t xml:space="preserve">Statistical Power Analysis for the Behavioral Sciences (2nd ed.). </w:t>
+      </w:r>
+      <w:r>
+        <w:rPr>
+          <w:rFonts w:ascii="Helvetica Neue" w:hAnsi="Helvetica Neue" w:eastAsia="Apple SD Gothic Neo"/>
+          <w:b w:val="0"/>
+          <w:i w:val="0"/>
+          <w:sz w:val="20"/>
+        </w:rPr>
+        <w:t>Lawrence Erlbaum Associates.</w:t>
+      </w:r>
+    </w:p>
+    <w:p>
+      <w:pPr>
+        <w:spacing w:after="120" w:line="336" w:lineRule="auto"/>
+        <w:ind w:left="454" w:hanging="454"/>
+      </w:pPr>
+      <w:r>
+        <w:rPr>
+          <w:rFonts w:ascii="Helvetica Neue" w:hAnsi="Helvetica Neue" w:eastAsia="Apple SD Gothic Neo"/>
+          <w:b/>
+          <w:i w:val="0"/>
+          <w:sz w:val="20"/>
+        </w:rPr>
+        <w:t xml:space="preserve">[3] </w:t>
+      </w:r>
+      <w:r>
+        <w:rPr>
+          <w:rFonts w:ascii="Helvetica Neue" w:hAnsi="Helvetica Neue" w:eastAsia="Apple SD Gothic Neo"/>
+          <w:b w:val="0"/>
+          <w:i w:val="0"/>
+          <w:sz w:val="20"/>
+        </w:rPr>
+        <w:t xml:space="preserve">Horvitz, D. G., &amp; Thompson, D. J. (1952). </w:t>
+      </w:r>
+      <w:r>
+        <w:rPr>
+          <w:rFonts w:ascii="Helvetica Neue" w:hAnsi="Helvetica Neue" w:eastAsia="Apple SD Gothic Neo"/>
+          <w:b w:val="0"/>
+          <w:i/>
+          <w:sz w:val="20"/>
+        </w:rPr>
+        <w:t xml:space="preserve">A Generalization of Sampling Without Replacement from a Finite Universe. </w:t>
+      </w:r>
+      <w:r>
+        <w:rPr>
+          <w:rFonts w:ascii="Helvetica Neue" w:hAnsi="Helvetica Neue" w:eastAsia="Apple SD Gothic Neo"/>
+          <w:b w:val="0"/>
+          <w:i w:val="0"/>
+          <w:sz w:val="20"/>
+        </w:rPr>
+        <w:t>Journal of the American Statistical Association, 47(260), 663–685.</w:t>
+      </w:r>
+    </w:p>
+    <w:p>
+      <w:pPr>
+        <w:spacing w:after="120" w:line="336" w:lineRule="auto"/>
+        <w:ind w:left="454" w:hanging="454"/>
+      </w:pPr>
+      <w:r>
+        <w:rPr>
+          <w:rFonts w:ascii="Helvetica Neue" w:hAnsi="Helvetica Neue" w:eastAsia="Apple SD Gothic Neo"/>
+          <w:b/>
+          <w:i w:val="0"/>
+          <w:sz w:val="20"/>
+        </w:rPr>
+        <w:t xml:space="preserve">[4] </w:t>
+      </w:r>
+      <w:r>
+        <w:rPr>
+          <w:rFonts w:ascii="Helvetica Neue" w:hAnsi="Helvetica Neue" w:eastAsia="Apple SD Gothic Neo"/>
+          <w:b w:val="0"/>
+          <w:i w:val="0"/>
+          <w:sz w:val="20"/>
+        </w:rPr>
+        <w:t xml:space="preserve">Neyman, J. (1934). </w:t>
+      </w:r>
+      <w:r>
+        <w:rPr>
+          <w:rFonts w:ascii="Helvetica Neue" w:hAnsi="Helvetica Neue" w:eastAsia="Apple SD Gothic Neo"/>
+          <w:b w:val="0"/>
+          <w:i/>
+          <w:sz w:val="20"/>
+        </w:rPr>
+        <w:t xml:space="preserve">On the Two Different Aspects of the Representative Method: The Method of Stratified Sampling and the Method of Purposive Selection. </w:t>
+      </w:r>
+      <w:r>
+        <w:rPr>
+          <w:rFonts w:ascii="Helvetica Neue" w:hAnsi="Helvetica Neue" w:eastAsia="Apple SD Gothic Neo"/>
+          <w:b w:val="0"/>
+          <w:i w:val="0"/>
+          <w:sz w:val="20"/>
+        </w:rPr>
+        <w:t>Journal of the Royal Statistical Society, 97(4), 558–625.</w:t>
+      </w:r>
+    </w:p>
+    <w:p>
+      <w:pPr>
+        <w:spacing w:after="120" w:line="336" w:lineRule="auto"/>
+        <w:ind w:left="454" w:hanging="454"/>
+      </w:pPr>
+      <w:r>
+        <w:rPr>
+          <w:rFonts w:ascii="Helvetica Neue" w:hAnsi="Helvetica Neue" w:eastAsia="Apple SD Gothic Neo"/>
+          <w:b/>
+          <w:i w:val="0"/>
+          <w:sz w:val="20"/>
+        </w:rPr>
+        <w:t xml:space="preserve">[5] </w:t>
+      </w:r>
+      <w:r>
+        <w:rPr>
+          <w:rFonts w:ascii="Helvetica Neue" w:hAnsi="Helvetica Neue" w:eastAsia="Apple SD Gothic Neo"/>
+          <w:b w:val="0"/>
+          <w:i w:val="0"/>
+          <w:sz w:val="20"/>
+        </w:rPr>
+        <w:t xml:space="preserve">Wilcoxon, F. (1945). </w:t>
+      </w:r>
+      <w:r>
+        <w:rPr>
+          <w:rFonts w:ascii="Helvetica Neue" w:hAnsi="Helvetica Neue" w:eastAsia="Apple SD Gothic Neo"/>
+          <w:b w:val="0"/>
+          <w:i/>
+          <w:sz w:val="20"/>
+        </w:rPr>
+        <w:t xml:space="preserve">Individual Comparisons by Ranking Methods. </w:t>
+      </w:r>
+      <w:r>
+        <w:rPr>
+          <w:rFonts w:ascii="Helvetica Neue" w:hAnsi="Helvetica Neue" w:eastAsia="Apple SD Gothic Neo"/>
+          <w:b w:val="0"/>
+          <w:i w:val="0"/>
+          <w:sz w:val="20"/>
+        </w:rPr>
+        <w:t>Biometrics Bulletin, 1(6), 80–83.</w:t>
+      </w:r>
+    </w:p>
+    <w:p>
+      <w:pPr>
+        <w:spacing w:after="120" w:line="336" w:lineRule="auto"/>
+        <w:ind w:left="454" w:hanging="454"/>
+      </w:pPr>
+      <w:r>
+        <w:rPr>
+          <w:rFonts w:ascii="Helvetica Neue" w:hAnsi="Helvetica Neue" w:eastAsia="Apple SD Gothic Neo"/>
+          <w:b/>
+          <w:i w:val="0"/>
+          <w:sz w:val="20"/>
+        </w:rPr>
+        <w:t xml:space="preserve">[6] </w:t>
+      </w:r>
+      <w:r>
+        <w:rPr>
+          <w:rFonts w:ascii="Helvetica Neue" w:hAnsi="Helvetica Neue" w:eastAsia="Apple SD Gothic Neo"/>
+          <w:b w:val="0"/>
+          <w:i w:val="0"/>
+          <w:sz w:val="20"/>
+        </w:rPr>
+        <w:t xml:space="preserve">Indyk, P., &amp; Motwani, R. (1998). </w:t>
+      </w:r>
+      <w:r>
+        <w:rPr>
+          <w:rFonts w:ascii="Helvetica Neue" w:hAnsi="Helvetica Neue" w:eastAsia="Apple SD Gothic Neo"/>
+          <w:b w:val="0"/>
+          <w:i/>
+          <w:sz w:val="20"/>
+        </w:rPr>
+        <w:t xml:space="preserve">Approximate Nearest Neighbors: Towards Removing the Curse of Dimensionality. </w:t>
+      </w:r>
+      <w:r>
+        <w:rPr>
+          <w:rFonts w:ascii="Helvetica Neue" w:hAnsi="Helvetica Neue" w:eastAsia="Apple SD Gothic Neo"/>
+          <w:b w:val="0"/>
+          <w:i w:val="0"/>
+          <w:sz w:val="20"/>
+        </w:rPr>
+        <w:t>Proceedings of the 30th Annual ACM Symposium on Theory of Computing (STOC), 604–613.</w:t>
+      </w:r>
+    </w:p>
+    <w:p>
+      <w:pPr>
+        <w:spacing w:after="120" w:line="336" w:lineRule="auto"/>
+        <w:ind w:left="454" w:hanging="454"/>
+      </w:pPr>
+      <w:r>
+        <w:rPr>
+          <w:rFonts w:ascii="Helvetica Neue" w:hAnsi="Helvetica Neue" w:eastAsia="Apple SD Gothic Neo"/>
+          <w:b/>
+          <w:i w:val="0"/>
+          <w:sz w:val="20"/>
+        </w:rPr>
+        <w:t xml:space="preserve">[7] </w:t>
+      </w:r>
+      <w:r>
+        <w:rPr>
+          <w:rFonts w:ascii="Helvetica Neue" w:hAnsi="Helvetica Neue" w:eastAsia="Apple SD Gothic Neo"/>
+          <w:b w:val="0"/>
+          <w:i w:val="0"/>
+          <w:sz w:val="20"/>
+        </w:rPr>
+        <w:t xml:space="preserve">Johnson, W. B., &amp; Lindenstrauss, J. (1984). </w:t>
+      </w:r>
+      <w:r>
+        <w:rPr>
+          <w:rFonts w:ascii="Helvetica Neue" w:hAnsi="Helvetica Neue" w:eastAsia="Apple SD Gothic Neo"/>
+          <w:b w:val="0"/>
+          <w:i/>
+          <w:sz w:val="20"/>
+        </w:rPr>
+        <w:t xml:space="preserve">Extensions of Lipschitz Mappings into a Hilbert Space. </w:t>
+      </w:r>
+      <w:r>
+        <w:rPr>
+          <w:rFonts w:ascii="Helvetica Neue" w:hAnsi="Helvetica Neue" w:eastAsia="Apple SD Gothic Neo"/>
+          <w:b w:val="0"/>
+          <w:i w:val="0"/>
+          <w:sz w:val="20"/>
+        </w:rPr>
+        <w:t>Contemporary Mathematics, 26, 189–206.</w:t>
+      </w:r>
+    </w:p>
+    <w:p>
+      <w:pPr>
+        <w:spacing w:after="120" w:line="336" w:lineRule="auto"/>
+        <w:ind w:left="454" w:hanging="454"/>
+      </w:pPr>
+      <w:r>
+        <w:rPr>
+          <w:rFonts w:ascii="Helvetica Neue" w:hAnsi="Helvetica Neue" w:eastAsia="Apple SD Gothic Neo"/>
+          <w:b/>
+          <w:i w:val="0"/>
+          <w:sz w:val="20"/>
+        </w:rPr>
+        <w:t xml:space="preserve">[8] </w:t>
+      </w:r>
+      <w:r>
+        <w:rPr>
+          <w:rFonts w:ascii="Helvetica Neue" w:hAnsi="Helvetica Neue" w:eastAsia="Apple SD Gothic Neo"/>
+          <w:b w:val="0"/>
+          <w:i w:val="0"/>
+          <w:sz w:val="20"/>
+        </w:rPr>
+        <w:t xml:space="preserve">Acharya, S., Gibbons, P. B., Poosala, V., &amp; Ramaswamy, S. (1999). </w:t>
+      </w:r>
+      <w:r>
+        <w:rPr>
+          <w:rFonts w:ascii="Helvetica Neue" w:hAnsi="Helvetica Neue" w:eastAsia="Apple SD Gothic Neo"/>
+          <w:b w:val="0"/>
+          <w:i/>
+          <w:sz w:val="20"/>
+        </w:rPr>
+        <w:t xml:space="preserve">Join Synopses for Approximate Query Answering. </w:t>
+      </w:r>
+      <w:r>
+        <w:rPr>
+          <w:rFonts w:ascii="Helvetica Neue" w:hAnsi="Helvetica Neue" w:eastAsia="Apple SD Gothic Neo"/>
+          <w:b w:val="0"/>
+          <w:i w:val="0"/>
+          <w:sz w:val="20"/>
+        </w:rPr>
+        <w:t>ACM SIGMOD Record, 28(2), 275–286.</w:t>
+      </w:r>
+    </w:p>
     <w:sectPr>
       <w:footerReference w:type="default" r:id="rId17"/>
       <w:pgSz w:w="12240" w:h="15840"/>

</xml_diff>

<commit_message>
sync: 표지 row height 1.0cm + 표 1·2 캡션 두 줄 + 모든 표↔캡션 spacing
- 표지 팀원/지도교수 표 row height 1.0cm + height_rule AT_LEAST + cell paragraph space 4pt (사용자: 헤더 회색박스 ↔ 데이터 row 답답)
- 표 1·2 캡션 한 줄 → 두 줄 분리 (사용자: 표에 너무 딱 붙음)
- 모든 표 캡션 (1·2·3·4·5) 의 paragraph space_before=8pt — 표 ↔ 캡션 spacing 확보
</commit_message>
<xml_diff>
--- a/submission/_drafts/속도는벡터_중간보고서.docx
+++ b/submission/_drafts/속도는벡터_중간보고서.docx
@@ -74,7 +74,7 @@
       </w:tblGrid>
       <w:tr>
         <w:trPr>
-          <w:trHeight w:val="482"/>
+          <w:trHeight w:val="567" w:hRule="atLeast"/>
         </w:trPr>
         <w:tc>
           <w:tcPr>
@@ -86,6 +86,7 @@
           </w:tcPr>
           <w:p>
             <w:pPr>
+              <w:spacing w:before="80" w:after="80"/>
               <w:jc w:val="center"/>
             </w:pPr>
             <w:r/>
@@ -103,7 +104,7 @@
       </w:tr>
       <w:tr>
         <w:trPr>
-          <w:trHeight w:val="482"/>
+          <w:trHeight w:val="567" w:hRule="atLeast"/>
         </w:trPr>
         <w:tc>
           <w:tcPr>
@@ -112,6 +113,7 @@
           </w:tcPr>
           <w:p>
             <w:pPr>
+              <w:spacing w:before="80" w:after="80"/>
               <w:jc w:val="center"/>
             </w:pPr>
             <w:r/>
@@ -133,6 +135,7 @@
           </w:tcPr>
           <w:p>
             <w:pPr>
+              <w:spacing w:before="80" w:after="80"/>
               <w:jc w:val="center"/>
             </w:pPr>
             <w:r/>
@@ -150,7 +153,7 @@
       </w:tr>
       <w:tr>
         <w:trPr>
-          <w:trHeight w:val="482"/>
+          <w:trHeight w:val="567" w:hRule="atLeast"/>
         </w:trPr>
         <w:tc>
           <w:tcPr>
@@ -159,6 +162,7 @@
           </w:tcPr>
           <w:p>
             <w:pPr>
+              <w:spacing w:before="80" w:after="80"/>
               <w:jc w:val="center"/>
             </w:pPr>
             <w:r/>
@@ -180,6 +184,7 @@
           </w:tcPr>
           <w:p>
             <w:pPr>
+              <w:spacing w:before="80" w:after="80"/>
               <w:jc w:val="center"/>
             </w:pPr>
             <w:r/>
@@ -197,7 +202,7 @@
       </w:tr>
       <w:tr>
         <w:trPr>
-          <w:trHeight w:val="482"/>
+          <w:trHeight w:val="567" w:hRule="atLeast"/>
         </w:trPr>
         <w:tc>
           <w:tcPr>
@@ -206,6 +211,7 @@
           </w:tcPr>
           <w:p>
             <w:pPr>
+              <w:spacing w:before="80" w:after="80"/>
               <w:jc w:val="center"/>
             </w:pPr>
             <w:r/>
@@ -227,6 +233,7 @@
           </w:tcPr>
           <w:p>
             <w:pPr>
+              <w:spacing w:before="80" w:after="80"/>
               <w:jc w:val="center"/>
             </w:pPr>
             <w:r/>
@@ -244,7 +251,7 @@
       </w:tr>
       <w:tr>
         <w:trPr>
-          <w:trHeight w:val="482"/>
+          <w:trHeight w:val="567" w:hRule="atLeast"/>
         </w:trPr>
         <w:tc>
           <w:tcPr>
@@ -253,6 +260,7 @@
           </w:tcPr>
           <w:p>
             <w:pPr>
+              <w:spacing w:before="80" w:after="80"/>
               <w:jc w:val="center"/>
             </w:pPr>
             <w:r/>
@@ -274,6 +282,7 @@
           </w:tcPr>
           <w:p>
             <w:pPr>
+              <w:spacing w:before="80" w:after="80"/>
               <w:jc w:val="center"/>
             </w:pPr>
             <w:r/>
@@ -302,7 +311,7 @@
       </w:tblGrid>
       <w:tr>
         <w:trPr>
-          <w:trHeight w:val="482"/>
+          <w:trHeight w:val="567" w:hRule="atLeast"/>
         </w:trPr>
         <w:tc>
           <w:tcPr>
@@ -311,6 +320,7 @@
           </w:tcPr>
           <w:p>
             <w:pPr>
+              <w:spacing w:before="80" w:after="80"/>
               <w:jc w:val="center"/>
             </w:pPr>
             <w:r/>
@@ -332,6 +342,7 @@
           </w:tcPr>
           <w:p>
             <w:pPr>
+              <w:spacing w:before="80" w:after="80"/>
               <w:jc w:val="center"/>
             </w:pPr>
             <w:r/>
@@ -349,7 +360,7 @@
       </w:tr>
       <w:tr>
         <w:trPr>
-          <w:trHeight w:val="482"/>
+          <w:trHeight w:val="567" w:hRule="atLeast"/>
         </w:trPr>
         <w:tc>
           <w:tcPr>
@@ -358,6 +369,7 @@
           </w:tcPr>
           <w:p>
             <w:pPr>
+              <w:spacing w:before="80" w:after="80"/>
               <w:jc w:val="center"/>
             </w:pPr>
             <w:r/>
@@ -379,6 +391,7 @@
           </w:tcPr>
           <w:p>
             <w:pPr>
+              <w:spacing w:before="80" w:after="80"/>
               <w:jc w:val="center"/>
             </w:pPr>
             <w:r/>
@@ -2391,7 +2404,7 @@
     </w:tbl>
     <w:p>
       <w:pPr>
-        <w:spacing w:after="120" w:line="336" w:lineRule="auto"/>
+        <w:spacing w:after="120" w:line="336" w:lineRule="auto" w:before="160"/>
         <w:jc w:val="center"/>
       </w:pPr>
       <w:r>
@@ -2401,7 +2414,9 @@
           <w:i w:val="0"/>
           <w:sz w:val="20"/>
         </w:rPr>
-        <w:t>표 1. Selectivity 별 SYSTEM 과 BERNOULLI 의 median Q-error 비교 (DEEP 1M, 100 query, plan_rows 기반 Python counterfactual)</w:t>
+        <w:t>표 1. Selectivity 별 SYSTEM 과 BERNOULLI 의 median Q-error 비교</w:t>
+        <w:br/>
+        <w:t>(DEEP 1M, 100 query, plan_rows 기반 Python counterfactual)</w:t>
       </w:r>
     </w:p>
     <w:p>
@@ -2963,7 +2978,7 @@
     </w:tbl>
     <w:p>
       <w:pPr>
-        <w:spacing w:after="120" w:line="336" w:lineRule="auto"/>
+        <w:spacing w:after="120" w:line="336" w:lineRule="auto" w:before="160"/>
         <w:jc w:val="center"/>
       </w:pPr>
       <w:r>
@@ -2973,7 +2988,9 @@
           <w:i w:val="0"/>
           <w:sz w:val="20"/>
         </w:rPr>
-        <w:t>표 2. KM20 vs BERN 의 5-seed 평균 개선율과 95 % 신뢰구간 (native vector.c 측정)</w:t>
+        <w:t>표 2. KM20 vs BERN 의 5-seed 평균 개선율과 95 % 신뢰구간</w:t>
+        <w:br/>
+        <w:t>(native vector.c 측정)</w:t>
       </w:r>
     </w:p>
     <w:p>
@@ -3943,7 +3960,7 @@
     </w:tbl>
     <w:p>
       <w:pPr>
-        <w:spacing w:after="120" w:line="336" w:lineRule="auto"/>
+        <w:spacing w:after="120" w:line="336" w:lineRule="auto" w:before="160"/>
         <w:jc w:val="center"/>
       </w:pPr>
       <w:r>
@@ -4418,7 +4435,7 @@
     </w:tbl>
     <w:p>
       <w:pPr>
-        <w:spacing w:after="120" w:line="336" w:lineRule="auto"/>
+        <w:spacing w:after="120" w:line="336" w:lineRule="auto" w:before="160"/>
         <w:jc w:val="center"/>
       </w:pPr>
       <w:r>
@@ -4660,7 +4677,7 @@
     </w:tbl>
     <w:p>
       <w:pPr>
-        <w:spacing w:after="120" w:line="336" w:lineRule="auto"/>
+        <w:spacing w:after="120" w:line="336" w:lineRule="auto" w:before="160"/>
         <w:jc w:val="center"/>
       </w:pPr>
       <w:r>

</xml_diff>

<commit_message>
sync: 그림 4·6 캡션 두 줄 + figure↔caption spacing + 모든 표 캡션 space_before 14pt
- add_figure: figure ↔ caption 사이 line break 2개 추가 (사용자: 캡션이 그림에 너무 붙음)
- add_figure: caption 안 \n 처리 → 두 줄 분리 가능
- 그림 4 캡션 두 줄: "...100 query × 6 selectivity boxplot" / "(DEEP 1M, native vector.c 측정, y 축 log scale)"
- 그림 6 캡션 두 줄: "...개선율 (5-seed 95 % CI)." / "X 축은 selectivity 의 로그 스케일 내림차순 (좌측 0.5, 우측 0.01)"
- 모든 표 캡션 (1·2·3·4·5) space_before 8pt → 14pt (사용자: 표 ↔ 캡션 너무 딱 붙음)
</commit_message>
<xml_diff>
--- a/submission/_drafts/속도는벡터_중간보고서.docx
+++ b/submission/_drafts/속도는벡터_중간보고서.docx
@@ -961,6 +961,7 @@
       </w:r>
       <w:r>
         <w:br/>
+        <w:br/>
       </w:r>
       <w:r>
         <w:rPr>
@@ -1303,6 +1304,7 @@
         </w:drawing>
       </w:r>
       <w:r>
+        <w:br/>
         <w:br/>
       </w:r>
       <w:r>
@@ -2404,7 +2406,7 @@
     </w:tbl>
     <w:p>
       <w:pPr>
-        <w:spacing w:after="120" w:line="336" w:lineRule="auto" w:before="160"/>
+        <w:spacing w:after="120" w:line="336" w:lineRule="auto" w:before="280"/>
         <w:jc w:val="center"/>
       </w:pPr>
       <w:r>
@@ -2517,6 +2519,7 @@
         </w:drawing>
       </w:r>
       <w:r>
+        <w:br/>
         <w:br/>
       </w:r>
       <w:r>
@@ -2978,7 +2981,7 @@
     </w:tbl>
     <w:p>
       <w:pPr>
-        <w:spacing w:after="120" w:line="336" w:lineRule="auto" w:before="160"/>
+        <w:spacing w:after="120" w:line="336" w:lineRule="auto" w:before="280"/>
         <w:jc w:val="center"/>
       </w:pPr>
       <w:r>
@@ -3055,6 +3058,7 @@
       </w:r>
       <w:r>
         <w:br/>
+        <w:br/>
       </w:r>
       <w:r>
         <w:rPr>
@@ -3063,7 +3067,19 @@
           <w:i w:val="0"/>
           <w:sz w:val="19"/>
         </w:rPr>
-        <w:t>그림 4.  Phase 6 Step 4 — BERNOULLI vs STRATIFIED (KM20) 100 query × 6 selectivity boxplot (DEEP 1M, native vector.c 측정, y 축 log scale)</w:t>
+        <w:t>그림 4.  Phase 6 Step 4 — BERNOULLI vs STRATIFIED (KM20) 100 query × 6 selectivity boxplot</w:t>
+      </w:r>
+      <w:r>
+        <w:br/>
+      </w:r>
+      <w:r>
+        <w:rPr>
+          <w:rFonts w:ascii="Helvetica Neue" w:hAnsi="Helvetica Neue" w:eastAsia="Apple SD Gothic Neo"/>
+          <w:b w:val="0"/>
+          <w:i w:val="0"/>
+          <w:sz w:val="19"/>
+        </w:rPr>
+        <w:t>(DEEP 1M, native vector.c 측정, y 축 log scale)</w:t>
       </w:r>
     </w:p>
     <w:p>
@@ -3107,6 +3123,7 @@
         </w:drawing>
       </w:r>
       <w:r>
+        <w:br/>
         <w:br/>
       </w:r>
       <w:r>
@@ -3161,6 +3178,7 @@
       </w:r>
       <w:r>
         <w:br/>
+        <w:br/>
       </w:r>
       <w:r>
         <w:rPr>
@@ -3169,7 +3187,19 @@
           <w:i w:val="0"/>
           <w:sz w:val="19"/>
         </w:rPr>
-        <w:t>그림 6. 세 데이터셋의 selectivity 별 KM20 vs BERN 개선율 (5-seed 95 % CI). X 축은 selectivity 의 로그 스케일 내림차순 (좌측 0.5, 우측 0.01)</w:t>
+        <w:t>그림 6. 세 데이터셋의 selectivity 별 KM20 vs BERN 개선율 (5-seed 95 % CI).</w:t>
+      </w:r>
+      <w:r>
+        <w:br/>
+      </w:r>
+      <w:r>
+        <w:rPr>
+          <w:rFonts w:ascii="Helvetica Neue" w:hAnsi="Helvetica Neue" w:eastAsia="Apple SD Gothic Neo"/>
+          <w:b w:val="0"/>
+          <w:i w:val="0"/>
+          <w:sz w:val="19"/>
+        </w:rPr>
+        <w:t>X 축은 selectivity 의 로그 스케일 내림차순 (좌측 0.5, 우측 0.01)</w:t>
       </w:r>
     </w:p>
     <w:p>
@@ -3299,6 +3329,7 @@
       </w:r>
       <w:r>
         <w:br/>
+        <w:br/>
       </w:r>
       <w:r>
         <w:rPr>
@@ -3382,6 +3413,7 @@
         </w:drawing>
       </w:r>
       <w:r>
+        <w:br/>
         <w:br/>
       </w:r>
       <w:r>
@@ -3960,7 +3992,7 @@
     </w:tbl>
     <w:p>
       <w:pPr>
-        <w:spacing w:after="120" w:line="336" w:lineRule="auto" w:before="160"/>
+        <w:spacing w:after="120" w:line="336" w:lineRule="auto" w:before="280"/>
         <w:jc w:val="center"/>
       </w:pPr>
       <w:r>
@@ -4435,7 +4467,7 @@
     </w:tbl>
     <w:p>
       <w:pPr>
-        <w:spacing w:after="120" w:line="336" w:lineRule="auto" w:before="160"/>
+        <w:spacing w:after="120" w:line="336" w:lineRule="auto" w:before="280"/>
         <w:jc w:val="center"/>
       </w:pPr>
       <w:r>
@@ -4677,7 +4709,7 @@
     </w:tbl>
     <w:p>
       <w:pPr>
-        <w:spacing w:after="120" w:line="336" w:lineRule="auto" w:before="160"/>
+        <w:spacing w:after="120" w:line="336" w:lineRule="auto" w:before="280"/>
         <w:jc w:val="center"/>
       </w:pPr>
       <w:r>

</xml_diff>